<commit_message>
docs: prepare proposal for student and supervisor signatures
</commit_message>
<xml_diff>
--- a/开题材料/Proposal_English_Final.docx
+++ b/开题材料/Proposal_English_Final.docx
@@ -337,7 +337,7 @@
                 <w:b w:val="0"/>
                 <w:sz w:val="20"/>
               </w:rPr>
-              <w:t>[FULL NAME], [STUDENT ID]</w:t>
+              <w:t>Huang Junkai, 201804121</w:t>
             </w:r>
           </w:p>
         </w:tc>
@@ -391,7 +391,7 @@
                 <w:b w:val="0"/>
                 <w:sz w:val="20"/>
               </w:rPr>
-              <w:t>[OFFICIAL DEGREE TITLE]</w:t>
+              <w:t>Electronic and Electrical Engineering</w:t>
             </w:r>
           </w:p>
         </w:tc>
@@ -1418,7 +1418,7 @@
                 <w:b w:val="0"/>
                 <w:sz w:val="18"/>
               </w:rPr>
-              <w:t>Figure 1. Planned project weeks, milestones and provisional New Year break. Table 1 gives dependencies and effort.</w:t>
+              <w:t>Figure 1. Planned project weeks and milestones; New Year work break: 1–14 February 2027 (Week 22–23). Table 1 gives dependencies and effort.</w:t>
             </w:r>
           </w:p>
         </w:tc>
@@ -1460,7 +1460,7 @@
                 <w:b w:val="0"/>
                 <w:sz w:val="20"/>
               </w:rPr>
-              <w:t>Reserve Week 22–23 (1–14 February 2027) as a provisional two-week Chinese New Year work break. Lunar New Year's Day is 6 February 2027; the institutional holiday length remains unconfirmed. No task bars cross the break. Budget 400 hours overall: 372 through Week 24 and 28 for the viva. This is a planning allocation, not completed work. The handbook states approximately 400 module hours but describes a Week 4–24 working period without explicitly allocating viva hours; the inclusive total here is a project budgeting choice, not a confirmed course interpretation.</w:t>
+              <w:t>The project plan sets 1–14 February 2027 as a two-week Chinese New Year work break, corresponding to Week 22–23 under the consecutive planning-week convention. This is the student's work schedule, not an institutional holiday approval. No task bars cross the break. Budget 400 hours overall: 372 through Week 24 and 28 for the viva. This is a planning allocation, not completed work. The handbook states approximately 400 module hours but describes a Week 4–24 working period without explicitly allocating viva hours; the inclusive total here is a project budgeting choice, not a confirmed course interpretation.</w:t>
             </w:r>
           </w:p>
           <w:p>
@@ -4303,7 +4303,7 @@
     </w:p>
     <w:p>
       <w:pPr>
-        <w:spacing w:after="0" w:before="0"/>
+        <w:spacing w:after="0" w:before="0" w:line="40" w:lineRule="exact"/>
         <w:rPr>
           <w:rFonts w:ascii="Arial" w:eastAsia="Arial" w:hAnsi="Arial" w:cs="Arial"/>
           <w:sz w:val="8"/>
@@ -4335,7 +4335,7 @@
     </w:p>
     <w:p>
       <w:pPr>
-        <w:spacing w:line="259" w:lineRule="auto" w:after="0" w:before="0"/>
+        <w:spacing w:line="40" w:lineRule="exact" w:after="0" w:before="0"/>
         <w:rPr>
           <w:rFonts w:ascii="Arial" w:eastAsia="Arial" w:hAnsi="Arial" w:cs="Arial"/>
           <w:i/>
@@ -4452,7 +4452,7 @@
     </w:tbl>
     <w:p>
       <w:pPr>
-        <w:spacing w:line="259" w:lineRule="auto" w:after="0" w:before="0"/>
+        <w:spacing w:line="40" w:lineRule="exact" w:after="0" w:before="0"/>
         <w:rPr>
           <w:rFonts w:ascii="Arial" w:eastAsia="Arial" w:hAnsi="Arial" w:cs="Arial"/>
           <w:i/>
@@ -4496,7 +4496,7 @@
     </w:p>
     <w:p>
       <w:pPr>
-        <w:spacing w:after="0" w:before="0"/>
+        <w:spacing w:after="0" w:before="0" w:line="40" w:lineRule="exact"/>
         <w:rPr>
           <w:rFonts w:ascii="Arial" w:eastAsia="Arial" w:hAnsi="Arial" w:cs="Arial"/>
           <w:sz w:val="8"/>
@@ -4587,7 +4587,7 @@
                 <w:b w:val="0"/>
                 <w:sz w:val="20"/>
               </w:rPr>
-              <w:t>Use technical documents and researcher-prepared questions; no participant recruitment or personal-data study is planned. Record provenance, confidentiality and permission for cloud processing before sending each document. A local permission toggle records a decision but does not establish legal permission. Exclude restricted material and engineering drawings from external processing in this phase. Check service retention conditions for permitted data.</w:t>
+              <w:t>The project will use railway technical standards and researcher-prepared questions to evaluate a document-based question-answering system. No human participants, surveys, interviews or personal-data analysis are planned. Evaluation will use a fixed question set rather than collecting user conversations.</w:t>
             </w:r>
           </w:p>
           <w:p>
@@ -4602,7 +4602,7 @@
                 <w:b w:val="0"/>
                 <w:sz w:val="20"/>
               </w:rPr>
-              <w:t>Acknowledge the supplied reference implementation, literature and AI assistance in code and writing; keep development records. Do not present generated annotations, planned improvements or test targets as measured results. The applicable assessment brief governs permitted assistance. The unselected ethics options and signature fields follow below; the student and supervisor must determine the applicable option. Any later participant study requires review before recruitment.</w:t>
+              <w:t>Document provenance and permitted uses will be recorded before ingestion. Only material permitted for external processing will be sent to chat or embedding services; this includes document chunks used to build the vector index. Restricted documents, personal information and operationally sensitive railway material will be excluded. Provider retention conditions will be checked, and only the text required for each request will be transmitted. Unresolved permissions will lead to exclusion or replacement, not assumed consent. Published outputs will use permitted excerpts and source references rather than redistribute complete standards.</w:t>
             </w:r>
           </w:p>
           <w:p>
@@ -4617,7 +4617,7 @@
                 <w:b w:val="0"/>
                 <w:sz w:val="20"/>
               </w:rPr>
-              <w:t>[ ] My project does not involve human participants, personal data or other ethical issues requiring review.</w:t>
+              <w:t>Incorrect editions, unsupported claims and omitted conditions could mislead readers. Answers will display source locations and edition labels, with refusal or clarification where evidence is inadequate. The system will support study and document consultation; it will not authorise maintenance, railway operation or safety-critical decisions. Readers must verify the original standard before any practical use.</w:t>
             </w:r>
           </w:p>
           <w:p>
@@ -4632,7 +4632,7 @@
                 <w:b w:val="0"/>
                 <w:sz w:val="20"/>
               </w:rPr>
-              <w:t>[ ] My project involves human participants, personal data or other ethical issues. I have discussed this with my supervisor and will obtain ethical approval before starting that work.</w:t>
+              <w:t>Reference code, literature and permitted AI assistance will be acknowledged. Benchmark answers will be checked against source text, and all configurations, failures and measured results will be reported honestly. Any later participant study or change in data use will require renewed ethics screening before that work begins.</w:t>
             </w:r>
           </w:p>
           <w:p>
@@ -4647,7 +4647,37 @@
                 <w:b w:val="0"/>
                 <w:sz w:val="20"/>
               </w:rPr>
-              <w:t>Ethics option / discussion date: [TO BE COMPLETED].</w:t>
+              <w:t>Student ethics assessment for the defined scope: the first option below is selected on the basis of the document-only methodology and the permission controls stated above, for supervisor review.</w:t>
+            </w:r>
+          </w:p>
+          <w:p>
+            <w:pPr>
+              <w:keepLines/>
+              <w:widowControl/>
+              <w:spacing w:after="60" w:before="0" w:line="240" w:lineRule="auto"/>
+            </w:pPr>
+            <w:r>
+              <w:rPr>
+                <w:rFonts w:ascii="Arial" w:hAnsi="Arial"/>
+                <w:b w:val="0"/>
+                <w:sz w:val="20"/>
+              </w:rPr>
+              <w:t>[x] My project does not involve human participants, personal data or other ethical issues requiring review.</w:t>
+            </w:r>
+          </w:p>
+          <w:p>
+            <w:pPr>
+              <w:keepLines/>
+              <w:widowControl/>
+              <w:spacing w:after="60" w:before="0" w:line="240" w:lineRule="auto"/>
+            </w:pPr>
+            <w:r>
+              <w:rPr>
+                <w:rFonts w:ascii="Arial" w:hAnsi="Arial"/>
+                <w:b w:val="0"/>
+                <w:sz w:val="20"/>
+              </w:rPr>
+              <w:t>[ ] My project involves human participants, personal data or other ethical issues. I have discussed this with my supervisor and will obtain ethical approval before starting that work.</w:t>
             </w:r>
           </w:p>
         </w:tc>
@@ -4655,7 +4685,7 @@
     </w:tbl>
     <w:p>
       <w:pPr>
-        <w:spacing w:after="0" w:before="0"/>
+        <w:spacing w:after="0" w:before="0" w:line="40" w:lineRule="exact"/>
       </w:pPr>
     </w:p>
     <w:p>
@@ -5260,7 +5290,7 @@
                       <w:b w:val="0"/>
                       <w:sz w:val="18"/>
                     </w:rPr>
-                    <w:t>Milestone slips: protect the provisional Week 22–23 break; prioritise five comparisons and finish report/video by Week 21, with Week 24 checks. Recheck date mapping and timed annotation/scoring pilots; keep OCR/drawings out of scope. T11–T15; preserve Symposium attendance.</w:t>
+                    <w:t>Milestone slips: protect the planned 1–14 February break (Week 22–23); prioritise five comparisons and finish report/video by Week 21, with Week 24 checks. Recheck date mapping and timed annotation/scoring pilots; keep OCR/drawings out of scope. T11–T15; preserve Symposium attendance.</w:t>
                   </w:r>
                 </w:p>
               </w:tc>
@@ -5364,7 +5394,7 @@
     </w:tbl>
     <w:p>
       <w:pPr>
-        <w:spacing w:line="259" w:lineRule="auto" w:after="0" w:before="0"/>
+        <w:spacing w:line="40" w:lineRule="exact" w:after="0" w:before="0"/>
         <w:rPr>
           <w:rFonts w:ascii="Arial" w:eastAsia="Arial" w:hAnsi="Arial" w:cs="Arial"/>
           <w:i/>
@@ -5374,7 +5404,7 @@
     </w:p>
     <w:p>
       <w:pPr>
-        <w:spacing w:line="259" w:lineRule="auto" w:after="0" w:before="0"/>
+        <w:spacing w:line="40" w:lineRule="exact" w:after="0" w:before="0"/>
         <w:rPr>
           <w:rFonts w:ascii="Arial" w:eastAsia="Arial" w:hAnsi="Arial" w:cs="Arial"/>
           <w:i/>
@@ -5384,7 +5414,7 @@
     </w:p>
     <w:p>
       <w:pPr>
-        <w:spacing w:line="259" w:lineRule="auto" w:after="0" w:before="0"/>
+        <w:spacing w:line="40" w:lineRule="exact" w:after="0" w:before="0"/>
         <w:rPr>
           <w:rFonts w:ascii="Arial" w:eastAsia="Arial" w:hAnsi="Arial" w:cs="Arial"/>
           <w:i/>
@@ -5471,7 +5501,7 @@
     </w:tbl>
     <w:p>
       <w:pPr>
-        <w:spacing w:line="259" w:lineRule="auto" w:after="0" w:before="0"/>
+        <w:spacing w:line="40" w:lineRule="exact" w:after="0" w:before="0"/>
         <w:rPr>
           <w:rFonts w:ascii="Arial" w:eastAsia="Arial" w:hAnsi="Arial" w:cs="Arial"/>
           <w:i/>
@@ -5481,7 +5511,7 @@
     </w:p>
     <w:p>
       <w:pPr>
-        <w:spacing w:line="259" w:lineRule="auto" w:after="0" w:before="0"/>
+        <w:spacing w:line="40" w:lineRule="exact" w:after="0" w:before="0"/>
         <w:rPr>
           <w:rFonts w:ascii="Arial" w:eastAsia="Arial" w:hAnsi="Arial" w:cs="Arial"/>
           <w:b/>
@@ -5528,7 +5558,7 @@
     </w:p>
     <w:p>
       <w:pPr>
-        <w:spacing w:after="0" w:before="0"/>
+        <w:spacing w:after="0" w:before="0" w:line="40" w:lineRule="exact"/>
         <w:rPr>
           <w:rFonts w:ascii="Arial" w:eastAsia="Arial" w:hAnsi="Arial" w:cs="Arial"/>
           <w:sz w:val="8"/>
@@ -5580,7 +5610,7 @@
                 <w:b w:val="0"/>
                 <w:sz w:val="20"/>
               </w:rPr>
-              <w:t>Specialist laboratory required: No. Work is desktop software and document analysis; there are no live railway, high-voltage, workshop or field experiments. Follow workstation ergonomics and normal computer electrical-safety procedures. Existing risk-assessment coverage / whether a new assessment is required: [TO BE CONFIRMED WITH SUPERVISOR].</w:t>
+              <w:t>Specialist laboratory required: No. The project will involve computer-based document processing, software development and local demonstrations. It will not involve railway access, live contact systems, high-voltage equipment, workshop manufacture or hardware modification. The researcher will use an ordinary workstation and follow the School's applicable computer-use and electrical-safety procedures.</w:t>
             </w:r>
           </w:p>
           <w:p>
@@ -5595,9 +5625,365 @@
                 <w:b w:val="0"/>
                 <w:sz w:val="20"/>
               </w:rPr>
-              <w:t>My project work will not be covered by existing Risk Assessments. A new one is required. Yes [ ] / No [ ] — [PENDING SUPERVISOR CONFIRMATION]. Assessment reference and precautions, if applicable: [TO BE COMPLETED BEFORE PRACTICAL WORK].</w:t>
+              <w:t>The following project-specific assessment is submitted for supervisor review; coverage by an existing School assessment has not been established. L/M/H denote low/medium/high likelihood and impact. Residual ratings assume that the listed controls are applied; they do not represent measured accident rates.</w:t>
             </w:r>
           </w:p>
+          <w:tbl>
+            <w:tblPr>
+              <w:tblStyle w:val="TableGrid"/>
+              <w:tblW w:type="auto" w:w="0"/>
+              <w:tblLayout w:type="fixed"/>
+              <w:tblLook w:firstColumn="1" w:firstRow="1" w:lastColumn="0" w:lastRow="0" w:noHBand="0" w:noVBand="1" w:val="04A0"/>
+            </w:tblPr>
+            <w:tblGrid>
+              <w:gridCol w:w="2016"/>
+              <w:gridCol w:w="1080"/>
+              <w:gridCol w:w="5760"/>
+              <w:gridCol w:w="1224"/>
+            </w:tblGrid>
+            <w:tr>
+              <w:trPr>
+                <w:cantSplit/>
+                <w:tblHeader/>
+              </w:trPr>
+              <w:tc>
+                <w:tcPr>
+                  <w:tcW w:type="dxa" w:w="2016"/>
+                </w:tcPr>
+                <w:p>
+                  <w:pPr>
+                    <w:keepLines/>
+                    <w:widowControl/>
+                    <w:spacing w:after="0" w:before="0" w:line="240" w:lineRule="auto"/>
+                  </w:pPr>
+                  <w:r>
+                    <w:rPr>
+                      <w:rFonts w:ascii="Arial" w:hAnsi="Arial"/>
+                      <w:b/>
+                      <w:sz w:val="18"/>
+                    </w:rPr>
+                    <w:t>Hazard / persons affected</w:t>
+                  </w:r>
+                </w:p>
+              </w:tc>
+              <w:tc>
+                <w:tcPr>
+                  <w:tcW w:type="dxa" w:w="1080"/>
+                </w:tcPr>
+                <w:p>
+                  <w:pPr>
+                    <w:keepLines/>
+                    <w:widowControl/>
+                    <w:spacing w:after="0" w:before="0" w:line="240" w:lineRule="auto"/>
+                  </w:pPr>
+                  <w:r>
+                    <w:rPr>
+                      <w:rFonts w:ascii="Arial" w:hAnsi="Arial"/>
+                      <w:b/>
+                      <w:sz w:val="18"/>
+                    </w:rPr>
+                    <w:t>Initial L/I</w:t>
+                  </w:r>
+                </w:p>
+              </w:tc>
+              <w:tc>
+                <w:tcPr>
+                  <w:tcW w:type="dxa" w:w="5760"/>
+                </w:tcPr>
+                <w:p>
+                  <w:pPr>
+                    <w:keepLines/>
+                    <w:widowControl/>
+                    <w:spacing w:after="0" w:before="0" w:line="240" w:lineRule="auto"/>
+                  </w:pPr>
+                  <w:r>
+                    <w:rPr>
+                      <w:rFonts w:ascii="Arial" w:hAnsi="Arial"/>
+                      <w:b/>
+                      <w:sz w:val="18"/>
+                    </w:rPr>
+                    <w:t>Planned precautions</w:t>
+                  </w:r>
+                </w:p>
+              </w:tc>
+              <w:tc>
+                <w:tcPr>
+                  <w:tcW w:type="dxa" w:w="1224"/>
+                </w:tcPr>
+                <w:p>
+                  <w:pPr>
+                    <w:keepLines/>
+                    <w:widowControl/>
+                    <w:spacing w:after="0" w:before="0" w:line="240" w:lineRule="auto"/>
+                  </w:pPr>
+                  <w:r>
+                    <w:rPr>
+                      <w:rFonts w:ascii="Arial" w:hAnsi="Arial"/>
+                      <w:b/>
+                      <w:sz w:val="18"/>
+                    </w:rPr>
+                    <w:t>Residual L/I</w:t>
+                  </w:r>
+                </w:p>
+              </w:tc>
+            </w:tr>
+            <w:tr>
+              <w:trPr>
+                <w:cantSplit/>
+              </w:trPr>
+              <w:tc>
+                <w:tcPr>
+                  <w:tcW w:type="dxa" w:w="2016"/>
+                </w:tcPr>
+                <w:p>
+                  <w:pPr>
+                    <w:keepLines/>
+                    <w:widowControl/>
+                    <w:spacing w:after="0" w:before="0" w:line="240" w:lineRule="auto"/>
+                  </w:pPr>
+                  <w:r>
+                    <w:rPr>
+                      <w:rFonts w:ascii="Arial" w:hAnsi="Arial"/>
+                      <w:b w:val="0"/>
+                      <w:sz w:val="18"/>
+                    </w:rPr>
+                    <w:t>Prolonged screen work / researcher</w:t>
+                  </w:r>
+                </w:p>
+              </w:tc>
+              <w:tc>
+                <w:tcPr>
+                  <w:tcW w:type="dxa" w:w="1080"/>
+                </w:tcPr>
+                <w:p>
+                  <w:pPr>
+                    <w:keepLines/>
+                    <w:widowControl/>
+                    <w:spacing w:after="0" w:before="0" w:line="240" w:lineRule="auto"/>
+                  </w:pPr>
+                  <w:r>
+                    <w:rPr>
+                      <w:rFonts w:ascii="Arial" w:hAnsi="Arial"/>
+                      <w:b w:val="0"/>
+                      <w:sz w:val="18"/>
+                    </w:rPr>
+                    <w:t>M/L</w:t>
+                  </w:r>
+                </w:p>
+              </w:tc>
+              <w:tc>
+                <w:tcPr>
+                  <w:tcW w:type="dxa" w:w="5760"/>
+                </w:tcPr>
+                <w:p>
+                  <w:pPr>
+                    <w:keepLines/>
+                    <w:widowControl/>
+                    <w:spacing w:after="0" w:before="0" w:line="240" w:lineRule="auto"/>
+                  </w:pPr>
+                  <w:r>
+                    <w:rPr>
+                      <w:rFonts w:ascii="Arial" w:hAnsi="Arial"/>
+                      <w:b w:val="0"/>
+                      <w:sz w:val="18"/>
+                    </w:rPr>
+                    <w:t>Adjust seating and display position, use suitable lighting, take regular breaks and vary tasks to reduce fatigue and strain.</w:t>
+                  </w:r>
+                </w:p>
+              </w:tc>
+              <w:tc>
+                <w:tcPr>
+                  <w:tcW w:type="dxa" w:w="1224"/>
+                </w:tcPr>
+                <w:p>
+                  <w:pPr>
+                    <w:keepLines/>
+                    <w:widowControl/>
+                    <w:spacing w:after="0" w:before="0" w:line="240" w:lineRule="auto"/>
+                  </w:pPr>
+                  <w:r>
+                    <w:rPr>
+                      <w:rFonts w:ascii="Arial" w:hAnsi="Arial"/>
+                      <w:b w:val="0"/>
+                      <w:sz w:val="18"/>
+                    </w:rPr>
+                    <w:t>L/L</w:t>
+                  </w:r>
+                </w:p>
+              </w:tc>
+            </w:tr>
+            <w:tr>
+              <w:trPr>
+                <w:cantSplit/>
+              </w:trPr>
+              <w:tc>
+                <w:tcPr>
+                  <w:tcW w:type="dxa" w:w="2016"/>
+                </w:tcPr>
+                <w:p>
+                  <w:pPr>
+                    <w:keepLines/>
+                    <w:widowControl/>
+                    <w:spacing w:after="0" w:before="0" w:line="240" w:lineRule="auto"/>
+                  </w:pPr>
+                  <w:r>
+                    <w:rPr>
+                      <w:rFonts w:ascii="Arial" w:hAnsi="Arial"/>
+                      <w:b w:val="0"/>
+                      <w:sz w:val="18"/>
+                    </w:rPr>
+                    <w:t>Damaged computer power equipment / researcher</w:t>
+                  </w:r>
+                </w:p>
+              </w:tc>
+              <w:tc>
+                <w:tcPr>
+                  <w:tcW w:type="dxa" w:w="1080"/>
+                </w:tcPr>
+                <w:p>
+                  <w:pPr>
+                    <w:keepLines/>
+                    <w:widowControl/>
+                    <w:spacing w:after="0" w:before="0" w:line="240" w:lineRule="auto"/>
+                  </w:pPr>
+                  <w:r>
+                    <w:rPr>
+                      <w:rFonts w:ascii="Arial" w:hAnsi="Arial"/>
+                      <w:b w:val="0"/>
+                      <w:sz w:val="18"/>
+                    </w:rPr>
+                    <w:t>L/H</w:t>
+                  </w:r>
+                </w:p>
+              </w:tc>
+              <w:tc>
+                <w:tcPr>
+                  <w:tcW w:type="dxa" w:w="5760"/>
+                </w:tcPr>
+                <w:p>
+                  <w:pPr>
+                    <w:keepLines/>
+                    <w:widowControl/>
+                    <w:spacing w:after="0" w:before="0" w:line="240" w:lineRule="auto"/>
+                  </w:pPr>
+                  <w:r>
+                    <w:rPr>
+                      <w:rFonts w:ascii="Arial" w:hAnsi="Arial"/>
+                      <w:b w:val="0"/>
+                      <w:sz w:val="18"/>
+                    </w:rPr>
+                    <w:t>Use suitable intact power supplies, keep liquids away, avoid overloaded sockets and stop using damaged or overheating equipment; report faults rather than attempt electrical repair.</w:t>
+                  </w:r>
+                </w:p>
+              </w:tc>
+              <w:tc>
+                <w:tcPr>
+                  <w:tcW w:type="dxa" w:w="1224"/>
+                </w:tcPr>
+                <w:p>
+                  <w:pPr>
+                    <w:keepLines/>
+                    <w:widowControl/>
+                    <w:spacing w:after="0" w:before="0" w:line="240" w:lineRule="auto"/>
+                  </w:pPr>
+                  <w:r>
+                    <w:rPr>
+                      <w:rFonts w:ascii="Arial" w:hAnsi="Arial"/>
+                      <w:b w:val="0"/>
+                      <w:sz w:val="18"/>
+                    </w:rPr>
+                    <w:t>L/H</w:t>
+                  </w:r>
+                </w:p>
+              </w:tc>
+            </w:tr>
+            <w:tr>
+              <w:trPr>
+                <w:cantSplit/>
+              </w:trPr>
+              <w:tc>
+                <w:tcPr>
+                  <w:tcW w:type="dxa" w:w="2016"/>
+                </w:tcPr>
+                <w:p>
+                  <w:pPr>
+                    <w:keepLines/>
+                    <w:widowControl/>
+                    <w:spacing w:after="0" w:before="0" w:line="240" w:lineRule="auto"/>
+                  </w:pPr>
+                  <w:r>
+                    <w:rPr>
+                      <w:rFonts w:ascii="Arial" w:hAnsi="Arial"/>
+                      <w:b w:val="0"/>
+                      <w:sz w:val="18"/>
+                    </w:rPr>
+                    <w:t>Trailing leads or obstructed workspace / researcher and nearby users</w:t>
+                  </w:r>
+                </w:p>
+              </w:tc>
+              <w:tc>
+                <w:tcPr>
+                  <w:tcW w:type="dxa" w:w="1080"/>
+                </w:tcPr>
+                <w:p>
+                  <w:pPr>
+                    <w:keepLines/>
+                    <w:widowControl/>
+                    <w:spacing w:after="0" w:before="0" w:line="240" w:lineRule="auto"/>
+                  </w:pPr>
+                  <w:r>
+                    <w:rPr>
+                      <w:rFonts w:ascii="Arial" w:hAnsi="Arial"/>
+                      <w:b w:val="0"/>
+                      <w:sz w:val="18"/>
+                    </w:rPr>
+                    <w:t>M/M</w:t>
+                  </w:r>
+                </w:p>
+              </w:tc>
+              <w:tc>
+                <w:tcPr>
+                  <w:tcW w:type="dxa" w:w="5760"/>
+                </w:tcPr>
+                <w:p>
+                  <w:pPr>
+                    <w:keepLines/>
+                    <w:widowControl/>
+                    <w:spacing w:after="0" w:before="0" w:line="240" w:lineRule="auto"/>
+                  </w:pPr>
+                  <w:r>
+                    <w:rPr>
+                      <w:rFonts w:ascii="Arial" w:hAnsi="Arial"/>
+                      <w:b w:val="0"/>
+                      <w:sz w:val="18"/>
+                    </w:rPr>
+                    <w:t>Route cables away from walkways and keep the desk, floor and exits clear.</w:t>
+                  </w:r>
+                </w:p>
+              </w:tc>
+              <w:tc>
+                <w:tcPr>
+                  <w:tcW w:type="dxa" w:w="1224"/>
+                </w:tcPr>
+                <w:p>
+                  <w:pPr>
+                    <w:keepLines/>
+                    <w:widowControl/>
+                    <w:spacing w:after="0" w:before="0" w:line="240" w:lineRule="auto"/>
+                  </w:pPr>
+                  <w:r>
+                    <w:rPr>
+                      <w:rFonts w:ascii="Arial" w:hAnsi="Arial"/>
+                      <w:b w:val="0"/>
+                      <w:sz w:val="18"/>
+                    </w:rPr>
+                    <w:t>L/M</w:t>
+                  </w:r>
+                </w:p>
+              </w:tc>
+            </w:tr>
+          </w:tbl>
+          <w:p/>
           <w:p>
             <w:pPr>
               <w:keepLines/>
@@ -5610,7 +5996,7 @@
                 <w:b w:val="0"/>
                 <w:sz w:val="20"/>
               </w:rPr>
-              <w:t>Safety declaration — unsigned: “I have attended the Safety Briefing (included in the ELEC3801 introductory lectures) and my attendance was recorded. I am aware that full Risk Assessments relating to project work within the School have been conducted. I agree to comply with all the relevant safety policies.”</w:t>
+              <w:t>The researcher will review these precautions when the workspace or project scope changes and report incidents through the School's procedures. Any move to laboratory or railway work will require a separate assessment before it starts. The supervisor will review the assessment and its controls before practical work begins. Any separately prescribed School risk-assessment form will also be completed before that work; this Proposal does not replace it.</w:t>
             </w:r>
           </w:p>
           <w:p>
@@ -5625,7 +6011,37 @@
                 <w:b w:val="0"/>
                 <w:sz w:val="20"/>
               </w:rPr>
-              <w:t>Safety briefing attendance/date: [UNCONFIRMED].</w:t>
+              <w:t>My project work will not be covered by existing Risk Assessments. A new one is required. Yes [x] / No [ ]. A project-specific assessment is provided above because existing School coverage has not been established; it is submitted with this form for supervisor review.</w:t>
+            </w:r>
+          </w:p>
+          <w:p>
+            <w:pPr>
+              <w:keepLines/>
+              <w:widowControl/>
+              <w:spacing w:after="60" w:before="0" w:line="240" w:lineRule="auto"/>
+            </w:pPr>
+            <w:r>
+              <w:rPr>
+                <w:rFonts w:ascii="Arial" w:hAnsi="Arial"/>
+                <w:b w:val="0"/>
+                <w:sz w:val="20"/>
+              </w:rPr>
+              <w:t>Safety declaration (to be confirmed by the student's signature): “I have attended the Safety Briefing (included in the ELEC3801 introductory lectures) and my attendance was recorded. I am aware that full Risk Assessments relating to project work within the School have been conducted. I agree to comply with all the relevant safety policies.”</w:t>
+            </w:r>
+          </w:p>
+          <w:p>
+            <w:pPr>
+              <w:keepLines/>
+              <w:widowControl/>
+              <w:spacing w:after="60" w:before="0" w:line="240" w:lineRule="auto"/>
+            </w:pPr>
+            <w:r>
+              <w:rPr>
+                <w:rFonts w:ascii="Arial" w:hAnsi="Arial"/>
+                <w:b w:val="0"/>
+                <w:sz w:val="20"/>
+              </w:rPr>
+              <w:t>Student name: Huang Junkai. Student ID: 201804121.</w:t>
             </w:r>
           </w:p>
           <w:p>
@@ -5648,20 +6064,23 @@
     </w:tbl>
     <w:p>
       <w:pPr>
-        <w:spacing w:after="0" w:before="0"/>
+        <w:spacing w:after="0" w:before="0" w:line="40" w:lineRule="exact"/>
       </w:pPr>
     </w:p>
     <w:p>
       <w:pPr>
-        <w:spacing w:after="0" w:before="0"/>
+        <w:spacing w:after="0" w:before="0" w:line="40" w:lineRule="exact"/>
       </w:pPr>
       <w:r>
+        <w:rPr>
+          <w:sz w:val="4"/>
+        </w:rPr>
         <w:br/>
       </w:r>
     </w:p>
     <w:p>
       <w:pPr>
-        <w:spacing w:after="0" w:before="0"/>
+        <w:spacing w:after="0" w:before="0" w:line="40" w:lineRule="exact"/>
       </w:pPr>
     </w:p>
     <w:tbl>
@@ -5686,6 +6105,7 @@
       <w:tr>
         <w:trPr>
           <w:trHeight w:hRule="auto"/>
+          <w:cantSplit/>
         </w:trPr>
         <w:tc>
           <w:tcPr>
@@ -5710,7 +6130,7 @@
                 <w:b w:val="0"/>
                 <w:sz w:val="20"/>
               </w:rPr>
-              <w:t>Before submission, the supervisor should check and approve this form. A signature, or verbal, email or Teams confirmation, is accepted.</w:t>
+              <w:t>Before submission, the supervisor should review this form, including the ethics assessment and project-specific safety assessment, and approve it below.</w:t>
             </w:r>
           </w:p>
           <w:p>
@@ -5725,7 +6145,7 @@
                 <w:b w:val="0"/>
                 <w:sz w:val="20"/>
               </w:rPr>
-              <w:t>Supervisor approval — not yet given: “My student has completed this form satisfactorily and is aware of their safety responsibilities.”</w:t>
+              <w:t>Supervisor approval (to be confirmed by signature): “My student has completed this form satisfactorily and is aware of their safety responsibilities.”</w:t>
             </w:r>
           </w:p>
           <w:p>
@@ -5740,7 +6160,22 @@
                 <w:b w:val="0"/>
                 <w:sz w:val="20"/>
               </w:rPr>
-              <w:t>Supervisor signature or confirmation: ____________________. Date: __________. Means (signature / verbal / email / Teams): [TO BE COMPLETED AFTER REVIEW].</w:t>
+              <w:t>Supervisor name: Na Qin.</w:t>
+            </w:r>
+          </w:p>
+          <w:p>
+            <w:pPr>
+              <w:keepLines/>
+              <w:widowControl/>
+              <w:spacing w:after="60" w:before="0" w:line="240" w:lineRule="auto"/>
+            </w:pPr>
+            <w:r>
+              <w:rPr>
+                <w:rFonts w:ascii="Arial" w:hAnsi="Arial"/>
+                <w:b w:val="0"/>
+                <w:sz w:val="20"/>
+              </w:rPr>
+              <w:t>Supervisor signature or confirmation: ____________________ Date: __________.</w:t>
             </w:r>
           </w:p>
         </w:tc>
@@ -5748,7 +6183,7 @@
     </w:tbl>
     <w:p>
       <w:pPr>
-        <w:spacing w:after="0" w:before="0"/>
+        <w:spacing w:after="0" w:before="0" w:line="40" w:lineRule="exact"/>
         <w:rPr>
           <w:rFonts w:ascii="Arial" w:eastAsia="Arial" w:hAnsi="Arial" w:cs="Arial"/>
           <w:sz w:val="20"/>
@@ -5758,7 +6193,7 @@
     </w:p>
     <w:p>
       <w:pPr>
-        <w:spacing w:after="0" w:before="0"/>
+        <w:spacing w:after="0" w:before="0" w:line="40" w:lineRule="exact"/>
         <w:ind w:firstLine="720"/>
         <w:rPr>
           <w:rFonts w:ascii="Arial" w:eastAsia="Arial" w:hAnsi="Arial" w:cs="Arial"/>

</xml_diff>

<commit_message>
docs: update proposal supervisor and English title
</commit_message>
<xml_diff>
--- a/开题材料/Proposal_English_Final.docx
+++ b/开题材料/Proposal_English_Final.docx
@@ -445,7 +445,7 @@
                 <w:b w:val="0"/>
                 <w:sz w:val="20"/>
               </w:rPr>
-              <w:t>Na Qin</w:t>
+              <w:t>Deqing Huang</w:t>
             </w:r>
           </w:p>
         </w:tc>
@@ -499,7 +499,7 @@
                 <w:b w:val="0"/>
                 <w:sz w:val="20"/>
               </w:rPr>
-              <w:t>Design and Evaluation of a Large Language Model-Based Question-Answering System for Railway Overhead Contact Systems</w:t>
+              <w:t>A Study on a Large-Model-Based Intelligent Question-Answering System for the Overhead Contact System Field</w:t>
             </w:r>
           </w:p>
         </w:tc>
@@ -6160,7 +6160,7 @@
                 <w:b w:val="0"/>
                 <w:sz w:val="20"/>
               </w:rPr>
-              <w:t>Supervisor name: Na Qin.</w:t>
+              <w:t>Supervisor name: Deqing Huang.</w:t>
             </w:r>
           </w:p>
           <w:p>

</xml_diff>

<commit_message>
docs: standardize proposal student and supervisor name order
</commit_message>
<xml_diff>
--- a/开题材料/Proposal_English_Final.docx
+++ b/开题材料/Proposal_English_Final.docx
@@ -337,7 +337,7 @@
                 <w:b w:val="0"/>
                 <w:sz w:val="20"/>
               </w:rPr>
-              <w:t>Huang Junkai, 201804121</w:t>
+              <w:t>Junkai Huang, 201804121</w:t>
             </w:r>
           </w:p>
         </w:tc>
@@ -6041,7 +6041,7 @@
                 <w:b w:val="0"/>
                 <w:sz w:val="20"/>
               </w:rPr>
-              <w:t>Student name: Huang Junkai. Student ID: 201804121.</w:t>
+              <w:t>Student name: Junkai Huang. Student ID: 201804121.</w:t>
             </w:r>
           </w:p>
           <w:p>

</xml_diff>

<commit_message>
docs: select No for additional risk assessment
</commit_message>
<xml_diff>
--- a/开题材料/Proposal_English_Final.docx
+++ b/开题材料/Proposal_English_Final.docx
@@ -5625,7 +5625,7 @@
                 <w:b w:val="0"/>
                 <w:sz w:val="20"/>
               </w:rPr>
-              <w:t>The following project-specific assessment is submitted for supervisor review; coverage by an existing School assessment has not been established. L/M/H denote low/medium/high likelihood and impact. Residual ratings assume that the listed controls are applied; they do not represent measured accident rates.</w:t>
+              <w:t>The following table identifies the hazards and precautions for the computer-based project. L/M/H denote low/medium/high likelihood and impact. Residual ratings assume that the listed controls are applied; they do not represent measured accident rates.</w:t>
             </w:r>
           </w:p>
           <w:tbl>
@@ -6011,7 +6011,7 @@
                 <w:b w:val="0"/>
                 <w:sz w:val="20"/>
               </w:rPr>
-              <w:t>My project work will not be covered by existing Risk Assessments. A new one is required. Yes [ ] / No [ ]. To be completed by the supervisor after confirming existing School assessment coverage and whether a separate formal assessment is required. The project-specific hazards and precautions above are provided for that review.</w:t>
+              <w:t>My project work will not be covered by existing Risk Assessments. A new one is required. Yes [ ] / No [x].</w:t>
             </w:r>
           </w:p>
           <w:p>

</xml_diff>